<commit_message>
fixed header to be in body and not header
</commit_message>
<xml_diff>
--- a/report_generation/ALT TEXT.docx
+++ b/report_generation/ALT TEXT.docx
@@ -121,7 +121,31 @@
     </w:p>
     <w:p>
       <w:r>
-        <w:t>A graph showing the relative abundance of phytoplankton taxa each year.</w:t>
+        <w:t xml:space="preserve">A graph showing the </w:t>
+      </w:r>
+      <w:r>
+        <w:t xml:space="preserve">average </w:t>
+      </w:r>
+      <w:r>
+        <w:t>relative abundance of phytoplankton</w:t>
+      </w:r>
+      <w:r>
+        <w:t xml:space="preserve"> groups</w:t>
+      </w:r>
+      <w:r>
+        <w:t xml:space="preserve"> </w:t>
+      </w:r>
+      <w:r>
+        <w:t>(</w:t>
+      </w:r>
+      <w:r>
+        <w:t>taxa</w:t>
+      </w:r>
+      <w:r>
+        <w:t>)</w:t>
+      </w:r>
+      <w:r>
+        <w:t xml:space="preserve"> each year.</w:t>
       </w:r>
     </w:p>
     <w:p>

</xml_diff>